<commit_message>
Update create CF boot media
</commit_message>
<xml_diff>
--- a/NBIOS-CF/Bootfähigen IDE-CF Datenträger erstellen.docx
+++ b/NBIOS-CF/Bootfähigen IDE-CF Datenträger erstellen.docx
@@ -956,6 +956,33 @@
     </w:p>
     <w:p>
       <w:pPr>
+        <w:ind w:left="2832" w:hanging="2832"/>
+        <w:rPr>
+          <w:rFonts w:ascii="Arial" w:hAnsi="Arial" w:cs="Arial"/>
+          <w:sz w:val="24"/>
+          <w:szCs w:val="24"/>
+        </w:rPr>
+      </w:pPr>
+      <w:r>
+        <w:rPr>
+          <w:rFonts w:ascii="Arial" w:hAnsi="Arial" w:cs="Arial"/>
+          <w:sz w:val="24"/>
+          <w:szCs w:val="24"/>
+        </w:rPr>
+        <w:t>NGET.HEX</w:t>
+      </w:r>
+      <w:r>
+        <w:rPr>
+          <w:rFonts w:ascii="Arial" w:hAnsi="Arial" w:cs="Arial"/>
+          <w:sz w:val="24"/>
+          <w:szCs w:val="24"/>
+        </w:rPr>
+        <w:tab/>
+        <w:t>Transfer-Programm</w:t>
+      </w:r>
+    </w:p>
+    <w:p>
+      <w:pPr>
         <w:rPr>
           <w:rFonts w:ascii="Arial" w:hAnsi="Arial" w:cs="Arial"/>
           <w:b/>
@@ -1291,6 +1318,7 @@
           <w:sz w:val="24"/>
           <w:szCs w:val="24"/>
         </w:rPr>
+        <w:lastRenderedPageBreak/>
         <w:t>Wenn sich der Monitor zurückmeldet</w:t>
       </w:r>
       <w:r>
@@ -1342,7 +1370,6 @@
           <w:sz w:val="24"/>
           <w:szCs w:val="24"/>
         </w:rPr>
-        <w:lastRenderedPageBreak/>
         <w:t>Schreiben des CP/M und des BIOS</w:t>
       </w:r>
       <w:r>
@@ -2070,24 +2097,84 @@
           <w:sz w:val="24"/>
           <w:szCs w:val="24"/>
         </w:rPr>
-        <w:t>Dann RESET-Taste drücken (nicht ausschalten) und mit „</w:t>
-      </w:r>
-      <w:r>
-        <w:rPr>
-          <w:rFonts w:ascii="Arial" w:hAnsi="Arial" w:cs="Arial"/>
-          <w:b/>
-          <w:sz w:val="24"/>
-          <w:szCs w:val="24"/>
-        </w:rPr>
-        <w:t>I</w:t>
-      </w:r>
-      <w:r>
-        <w:rPr>
-          <w:rFonts w:ascii="Arial" w:hAnsi="Arial" w:cs="Arial"/>
-          <w:sz w:val="24"/>
-          <w:szCs w:val="24"/>
-        </w:rPr>
-        <w:t>“ vom IDE/CF-Medium booten. NPCGET.HEX befindet sich immer noch im Speicher und kann mit dem CP/M-Kommando „</w:t>
+        <w:t xml:space="preserve">Da der </w:t>
+      </w:r>
+      <w:proofErr w:type="spellStart"/>
+      <w:r>
+        <w:rPr>
+          <w:rFonts w:ascii="Arial" w:hAnsi="Arial" w:cs="Arial"/>
+          <w:sz w:val="24"/>
+          <w:szCs w:val="24"/>
+        </w:rPr>
+        <w:t>Bootloader</w:t>
+      </w:r>
+      <w:proofErr w:type="spellEnd"/>
+      <w:r>
+        <w:rPr>
+          <w:rFonts w:ascii="Arial" w:hAnsi="Arial" w:cs="Arial"/>
+          <w:sz w:val="24"/>
+          <w:szCs w:val="24"/>
+        </w:rPr>
+        <w:t xml:space="preserve"> </w:t>
+      </w:r>
+      <w:r>
+        <w:rPr>
+          <w:rFonts w:ascii="Arial" w:hAnsi="Arial" w:cs="Arial"/>
+          <w:sz w:val="24"/>
+          <w:szCs w:val="24"/>
+        </w:rPr>
+        <w:t xml:space="preserve">das Programm an Adresse 100h überschreiben würde, </w:t>
+      </w:r>
+      <w:r>
+        <w:rPr>
+          <w:rFonts w:ascii="Arial" w:hAnsi="Arial" w:cs="Arial"/>
+          <w:sz w:val="24"/>
+          <w:szCs w:val="24"/>
+        </w:rPr>
+        <w:t xml:space="preserve">startet man das CP/M direkt mit dem Monitor Befehl </w:t>
+      </w:r>
+      <w:r>
+        <w:rPr>
+          <w:rFonts w:ascii="Arial" w:hAnsi="Arial" w:cs="Arial"/>
+          <w:b/>
+          <w:sz w:val="24"/>
+          <w:szCs w:val="24"/>
+        </w:rPr>
+        <w:t>ge2</w:t>
+      </w:r>
+      <w:r>
+        <w:rPr>
+          <w:rFonts w:ascii="Arial" w:hAnsi="Arial" w:cs="Arial"/>
+          <w:b/>
+          <w:sz w:val="24"/>
+          <w:szCs w:val="24"/>
+        </w:rPr>
+        <w:t>00</w:t>
+      </w:r>
+      <w:r>
+        <w:rPr>
+          <w:rFonts w:ascii="Arial" w:hAnsi="Arial" w:cs="Arial"/>
+          <w:sz w:val="24"/>
+          <w:szCs w:val="24"/>
+        </w:rPr>
+        <w:t>.</w:t>
+      </w:r>
+    </w:p>
+    <w:p>
+      <w:pPr>
+        <w:rPr>
+          <w:rFonts w:ascii="Arial" w:hAnsi="Arial" w:cs="Arial"/>
+          <w:sz w:val="24"/>
+          <w:szCs w:val="24"/>
+        </w:rPr>
+      </w:pPr>
+      <w:r>
+        <w:rPr>
+          <w:rFonts w:ascii="Arial" w:hAnsi="Arial" w:cs="Arial"/>
+          <w:sz w:val="24"/>
+          <w:szCs w:val="24"/>
+        </w:rPr>
+        <w:t>NPCGET.HEX befindet sich immer noch im Speicher und kann mit dem CP/M-Kommando „</w:t>
       </w:r>
       <w:r>
         <w:rPr>
@@ -2359,15 +2446,6 @@
         </w:rPr>
         <w:t>et.</w:t>
       </w:r>
-    </w:p>
-    <w:p>
-      <w:pPr>
-        <w:rPr>
-          <w:rFonts w:ascii="Arial" w:hAnsi="Arial" w:cs="Arial"/>
-          <w:sz w:val="24"/>
-          <w:szCs w:val="24"/>
-        </w:rPr>
-      </w:pPr>
     </w:p>
     <w:sectPr>
       <w:footerReference w:type="default" r:id="rId8"/>
@@ -2422,7 +2500,31 @@
       <w:rPr>
         <w:rFonts w:asciiTheme="majorHAnsi" w:eastAsiaTheme="majorEastAsia" w:hAnsiTheme="majorHAnsi" w:cstheme="majorBidi"/>
       </w:rPr>
-      <w:t>Bootfähiges DIE/CF-Medium erstellen</w:t>
+      <w:t xml:space="preserve">Bootfähiges </w:t>
+    </w:r>
+    <w:r>
+      <w:rPr>
+        <w:rFonts w:asciiTheme="majorHAnsi" w:eastAsiaTheme="majorEastAsia" w:hAnsiTheme="majorHAnsi" w:cstheme="majorBidi"/>
+      </w:rPr>
+      <w:t>I</w:t>
+    </w:r>
+    <w:r>
+      <w:rPr>
+        <w:rFonts w:asciiTheme="majorHAnsi" w:eastAsiaTheme="majorEastAsia" w:hAnsiTheme="majorHAnsi" w:cstheme="majorBidi"/>
+      </w:rPr>
+      <w:t>DE</w:t>
+    </w:r>
+    <w:r>
+      <w:rPr>
+        <w:rFonts w:asciiTheme="majorHAnsi" w:eastAsiaTheme="majorEastAsia" w:hAnsiTheme="majorHAnsi" w:cstheme="majorBidi"/>
+      </w:rPr>
+      <w:t>/CF-Medium erstellen</w:t>
+    </w:r>
+    <w:r>
+      <w:rPr>
+        <w:rFonts w:asciiTheme="majorHAnsi" w:eastAsiaTheme="majorEastAsia" w:hAnsiTheme="majorHAnsi" w:cstheme="majorBidi"/>
+      </w:rPr>
+      <w:t>, Stand 08.08.2026</w:t>
     </w:r>
     <w:r>
       <w:rPr>

</xml_diff>